<commit_message>
content: prompts upgrade to 120 (add AI short-drama scripts + agent workflow automation)
</commit_message>
<xml_diff>
--- a/100-Money-Making-Prompts.docx
+++ b/100-Money-Making-Prompts.docx
@@ -4684,6 +4684,574 @@
         <w:br w:type="page"/>
       </w:r>
     </w:p>
+    <w:p>
+      <w:pPr>
+        <w:pStyle w:val="Heading1"/>
+      </w:pPr>
+      <w:r>
+        <w:t>Category 11: AI Short-Drama Scripts</w:t>
+      </w:r>
+    </w:p>
+    <w:p>
+      <w:r>
+        <w:t>2026's fastest-growing content lane - AI micro-dramas now make up over 95% of new short dramas. These prompts produce scripts, hooks, and production-ready output.</w:t>
+      </w:r>
+    </w:p>
+    <w:p/>
+    <w:p>
+      <w:pPr>
+        <w:pStyle w:val="Heading2"/>
+      </w:pPr>
+      <w:r>
+        <w:t>1. 60-Second Hook Script</w:t>
+      </w:r>
+    </w:p>
+    <w:p>
+      <w:pPr>
+        <w:pStyle w:val="PromptBox"/>
+      </w:pPr>
+      <w:r>
+        <w:t>Write a 60-second AI short-drama script for [NICHE] (e.g., thriller, romance, business). The first 3 seconds must open on a question or conflict that makes the viewer unable to scroll past. Include scene directions for AI video generation and a voiceover line per scene.</w:t>
+      </w:r>
+    </w:p>
+    <w:p>
+      <w:r>
+        <w:t>Use Case: Micro-drama content for TikTok/Shorts/Reels.</w:t>
+      </w:r>
+    </w:p>
+    <w:p>
+      <w:r>
+        <w:t>Expected Income: $20-100 per script</w:t>
+      </w:r>
+    </w:p>
+    <w:p/>
+    <w:p>
+      <w:pPr>
+        <w:pStyle w:val="Heading2"/>
+      </w:pPr>
+      <w:r>
+        <w:t>2. Retention Curve Builder</w:t>
+      </w:r>
+    </w:p>
+    <w:p>
+      <w:pPr>
+        <w:pStyle w:val="PromptBox"/>
+      </w:pPr>
+      <w:r>
+        <w:t>Design a 90-second micro-drama episode around a retention curve: hook (0-3s), setup (3-15s), first twist (15-40s), payoff (40-70s), cliffhanger (70-90s). Provide the beat-by-beat outline with timestamps.</w:t>
+      </w:r>
+    </w:p>
+    <w:p>
+      <w:r>
+        <w:t>Use Case: Structuring episodes that hold watch time.</w:t>
+      </w:r>
+    </w:p>
+    <w:p>
+      <w:r>
+        <w:t>Expected Income: $20-80 per outline</w:t>
+      </w:r>
+    </w:p>
+    <w:p/>
+    <w:p>
+      <w:pPr>
+        <w:pStyle w:val="Heading2"/>
+      </w:pPr>
+      <w:r>
+        <w:t>3. Cliffhanger Generator</w:t>
+      </w:r>
+    </w:p>
+    <w:p>
+      <w:pPr>
+        <w:pStyle w:val="PromptBox"/>
+      </w:pPr>
+      <w:r>
+        <w:t>Generate 5 cliffhanger endings for the next episode of this micro-drama series: [SERIES SUMMARY]. Each cliffhanger must raise a specific question and make the audience want episode 3 immediately. Keep each under 20 words.</w:t>
+      </w:r>
+    </w:p>
+    <w:p>
+      <w:r>
+        <w:t>Use Case: Ending episodes to drive binge-watching.</w:t>
+      </w:r>
+    </w:p>
+    <w:p>
+      <w:r>
+        <w:t>Expected Income: $15-50 per set</w:t>
+      </w:r>
+    </w:p>
+    <w:p/>
+    <w:p>
+      <w:pPr>
+        <w:pStyle w:val="Heading2"/>
+      </w:pPr>
+      <w:r>
+        <w:t>4. Character Arc in Five Scenes</w:t>
+      </w:r>
+    </w:p>
+    <w:p>
+      <w:pPr>
+        <w:pStyle w:val="PromptBox"/>
+      </w:pPr>
+      <w:r>
+        <w:t>Compress a full character arc (want, flaw, turning point, sacrifice, change) into five short scenes for a micro-drama. For each scene, give the location, action, one key line of dialogue, and the AI video prompt.</w:t>
+      </w:r>
+    </w:p>
+    <w:p>
+      <w:r>
+        <w:t>Use Case: Building characters without a long series.</w:t>
+      </w:r>
+    </w:p>
+    <w:p>
+      <w:r>
+        <w:t>Expected Income: $30-100 per arc</w:t>
+      </w:r>
+    </w:p>
+    <w:p/>
+    <w:p>
+      <w:pPr>
+        <w:pStyle w:val="Heading2"/>
+      </w:pPr>
+      <w:r>
+        <w:t>5. Punchy Dialogue Rewriter</w:t>
+      </w:r>
+    </w:p>
+    <w:p>
+      <w:pPr>
+        <w:pStyle w:val="PromptBox"/>
+      </w:pPr>
+      <w:r>
+        <w:t>Rewrite this dialogue for micro-drama pacing: [DIALOGUE]. Rules: maximum 12 words per line, no filler, every line either raises tension or reveals character. Output the rewritten exchange with a one-line note on what changed.</w:t>
+      </w:r>
+    </w:p>
+    <w:p>
+      <w:r>
+        <w:t>Use Case: Making dialogue feel native to short-form video.</w:t>
+      </w:r>
+    </w:p>
+    <w:p>
+      <w:r>
+        <w:t>Expected Income: $10-40 per scene</w:t>
+      </w:r>
+    </w:p>
+    <w:p/>
+    <w:p>
+      <w:pPr>
+        <w:pStyle w:val="Heading2"/>
+      </w:pPr>
+      <w:r>
+        <w:t>6. Ten-Episode Series Bible</w:t>
+      </w:r>
+    </w:p>
+    <w:p>
+      <w:pPr>
+        <w:pStyle w:val="PromptBox"/>
+      </w:pPr>
+      <w:r>
+        <w:t>Create a series bible for a 10-episode AI micro-drama in [NICHE]. Include: logline, main characters (2-3), episode-by-episode hook table, escalation ladder (each episode raises stakes), and the final payoff.</w:t>
+      </w:r>
+    </w:p>
+    <w:p>
+      <w:r>
+        <w:t>Use Case: Pitching or planning an entire short-drama run.</w:t>
+      </w:r>
+    </w:p>
+    <w:p>
+      <w:r>
+        <w:t>Expected Income: $100-400 per bible</w:t>
+      </w:r>
+    </w:p>
+    <w:p/>
+    <w:p>
+      <w:pPr>
+        <w:pStyle w:val="Heading2"/>
+      </w:pPr>
+      <w:r>
+        <w:t>7. Viral Story to Script</w:t>
+      </w:r>
+    </w:p>
+    <w:p>
+      <w:pPr>
+        <w:pStyle w:val="PromptBox"/>
+      </w:pPr>
+      <w:r>
+        <w:t>Turn this viral story into a micro-drama script: [STORY/LINK/SUMMARY]. Keep the emotional core, compress it to 90 seconds, and add a commercial twist that suits [PLATFORM]'s audience. Include the original hook verbatim if possible.</w:t>
+      </w:r>
+    </w:p>
+    <w:p>
+      <w:r>
+        <w:t>Use Case: Recycling viral stories into original content.</w:t>
+      </w:r>
+    </w:p>
+    <w:p>
+      <w:r>
+        <w:t>Expected Income: $30-120 per adaptation</w:t>
+      </w:r>
+    </w:p>
+    <w:p/>
+    <w:p>
+      <w:pPr>
+        <w:pStyle w:val="Heading2"/>
+      </w:pPr>
+      <w:r>
+        <w:t>8. Scene-by-Scene Video Prompts</w:t>
+      </w:r>
+    </w:p>
+    <w:p>
+      <w:pPr>
+        <w:pStyle w:val="PromptBox"/>
+      </w:pPr>
+      <w:r>
+        <w:t>Given this script, produce one AI video generation prompt per scene: [SCRIPT]. Each prompt must specify subject, camera movement, lighting, and style, formatted for tools like Kling, Seedance, or Runway.</w:t>
+      </w:r>
+    </w:p>
+    <w:p>
+      <w:r>
+        <w:t>Use Case: Production handoff for AI video tools.</w:t>
+      </w:r>
+    </w:p>
+    <w:p>
+      <w:r>
+        <w:t>Expected Income: $20-80 per script</w:t>
+      </w:r>
+    </w:p>
+    <w:p/>
+    <w:p>
+      <w:pPr>
+        <w:pStyle w:val="Heading2"/>
+      </w:pPr>
+      <w:r>
+        <w:t>9. Voiceover with Pacing Notes</w:t>
+      </w:r>
+    </w:p>
+    <w:p>
+      <w:pPr>
+        <w:pStyle w:val="PromptBox"/>
+      </w:pPr>
+      <w:r>
+        <w:t>Write the voiceover script for this micro-drama with pacing markers: [STORY]. Use [PAUSE] for beats, [SLOW] for tension, [FAST] for montage. Keep sentences under 10 words and mark where music should swell.</w:t>
+      </w:r>
+    </w:p>
+    <w:p>
+      <w:r>
+        <w:t>Use Case: Voiceover production with ElevenLabs-style tools.</w:t>
+      </w:r>
+    </w:p>
+    <w:p>
+      <w:r>
+        <w:t>Expected Income: $15-60 per script</w:t>
+      </w:r>
+    </w:p>
+    <w:p/>
+    <w:p>
+      <w:pPr>
+        <w:pStyle w:val="Heading2"/>
+      </w:pPr>
+      <w:r>
+        <w:t>10. Monetization Beat Placement</w:t>
+      </w:r>
+    </w:p>
+    <w:p>
+      <w:pPr>
+        <w:pStyle w:val="PromptBox"/>
+      </w:pPr>
+      <w:r>
+        <w:t>Place monetization beats into this micro-drama script without hurting retention: [SCRIPT]. Suggest where an affiliate mention, product placement, or CTA can fit naturally, and rewrite those 3 beats so they feel like part of the story.</w:t>
+      </w:r>
+    </w:p>
+    <w:p>
+      <w:r>
+        <w:t>Use Case: Adding sponsor/affiliate revenue to content.</w:t>
+      </w:r>
+    </w:p>
+    <w:p>
+      <w:r>
+        <w:t>Expected Income: $25-90 per script</w:t>
+      </w:r>
+    </w:p>
+    <w:p/>
+    <w:p>
+      <w:pPr>
+        <w:pStyle w:val="Heading1"/>
+      </w:pPr>
+      <w:r>
+        <w:t>Category 12: Agent Workflows &amp; Automation</w:t>
+      </w:r>
+    </w:p>
+    <w:p>
+      <w:r>
+        <w:t>Turn 'we should use AI' into a deliverable: audits, agent specs, and automation blueprints you can sell as a service.</w:t>
+      </w:r>
+    </w:p>
+    <w:p/>
+    <w:p>
+      <w:pPr>
+        <w:pStyle w:val="Heading2"/>
+      </w:pPr>
+      <w:r>
+        <w:t>1. Workflow Audit</w:t>
+      </w:r>
+    </w:p>
+    <w:p>
+      <w:pPr>
+        <w:pStyle w:val="PromptBox"/>
+      </w:pPr>
+      <w:r>
+        <w:t>Analyze this business description: [BUSINESS]. List its 10 most repetitive tasks, estimate hours spent per month on each, and rank the top 3 for AI automation by (time saved x ease of implementation). Output a table with the ranking.</w:t>
+      </w:r>
+    </w:p>
+    <w:p>
+      <w:r>
+        <w:t>Use Case: Finding automation opportunities for clients.</w:t>
+      </w:r>
+    </w:p>
+    <w:p>
+      <w:r>
+        <w:t>Expected Income: $50-200 per audit</w:t>
+      </w:r>
+    </w:p>
+    <w:p/>
+    <w:p>
+      <w:pPr>
+        <w:pStyle w:val="Heading2"/>
+      </w:pPr>
+      <w:r>
+        <w:t>2. Agent Specification Builder</w:t>
+      </w:r>
+    </w:p>
+    <w:p>
+      <w:pPr>
+        <w:pStyle w:val="PromptBox"/>
+      </w:pPr>
+      <w:r>
+        <w:t>Turn this workflow description into a build spec for an AI agent: [WORKFLOW]. Include: purpose, inputs, outputs, decision rules, edge cases to handle, and what must be escalated to a human. Output as a structured checklist.</w:t>
+      </w:r>
+    </w:p>
+    <w:p>
+      <w:r>
+        <w:t>Use Case: Scoping custom agents for businesses.</w:t>
+      </w:r>
+    </w:p>
+    <w:p>
+      <w:r>
+        <w:t>Expected Income: $50-250 per spec</w:t>
+      </w:r>
+    </w:p>
+    <w:p/>
+    <w:p>
+      <w:pPr>
+        <w:pStyle w:val="Heading2"/>
+      </w:pPr>
+      <w:r>
+        <w:t>3. Agent Skill Teaching Script</w:t>
+      </w:r>
+    </w:p>
+    <w:p>
+      <w:pPr>
+        <w:pStyle w:val="PromptBox"/>
+      </w:pPr>
+      <w:r>
+        <w:t>Write step-by-step instructions to teach an AI agent (e.g., OpenClaw) a new skill for [TASK]. Include: what files/data it needs, the exact steps to follow, error handling, and a test case to confirm the skill works.</w:t>
+      </w:r>
+    </w:p>
+    <w:p>
+      <w:r>
+        <w:t>Use Case: Building reusable agent skills for clients.</w:t>
+      </w:r>
+    </w:p>
+    <w:p>
+      <w:r>
+        <w:t>Expected Income: $30-120 per skill</w:t>
+      </w:r>
+    </w:p>
+    <w:p/>
+    <w:p>
+      <w:pPr>
+        <w:pStyle w:val="Heading2"/>
+      </w:pPr>
+      <w:r>
+        <w:t>4. n8n Workflow Blueprint</w:t>
+      </w:r>
+    </w:p>
+    <w:p>
+      <w:pPr>
+        <w:pStyle w:val="PromptBox"/>
+      </w:pPr>
+      <w:r>
+        <w:t>Design a workflow automation in n8n for [BUSINESS PROCESS]. Specify: trigger, each node and its purpose, data transformations, error handling, and a fallback notification if the workflow fails. Keep it implementable by a non-developer.</w:t>
+      </w:r>
+    </w:p>
+    <w:p>
+      <w:r>
+        <w:t>Use Case: Automation agency deliverables.</w:t>
+      </w:r>
+    </w:p>
+    <w:p>
+      <w:r>
+        <w:t>Expected Income: $50-300 per blueprint</w:t>
+      </w:r>
+    </w:p>
+    <w:p/>
+    <w:p>
+      <w:pPr>
+        <w:pStyle w:val="Heading2"/>
+      </w:pPr>
+      <w:r>
+        <w:t>5. Support Agent Training Pack</w:t>
+      </w:r>
+    </w:p>
+    <w:p>
+      <w:pPr>
+        <w:pStyle w:val="PromptBox"/>
+      </w:pPr>
+      <w:r>
+        <w:t>Turn this knowledge base into training material for a customer support AI agent: [DOCS/FAQ]. Define tone rules, common question patterns, when to escalate, and 10 test conversations with expected answers.</w:t>
+      </w:r>
+    </w:p>
+    <w:p>
+      <w:r>
+        <w:t>Use Case: Building support agents for small businesses.</w:t>
+      </w:r>
+    </w:p>
+    <w:p>
+      <w:r>
+        <w:t>Expected Income: $50-200 per pack</w:t>
+      </w:r>
+    </w:p>
+    <w:p/>
+    <w:p>
+      <w:pPr>
+        <w:pStyle w:val="Heading2"/>
+      </w:pPr>
+      <w:r>
+        <w:t>6. Daily Report Automation</w:t>
+      </w:r>
+    </w:p>
+    <w:p>
+      <w:pPr>
+        <w:pStyle w:val="PromptBox"/>
+      </w:pPr>
+      <w:r>
+        <w:t>Write a prompt that turns raw data (sales, tickets, traffic) into a one-page daily summary: [DATA SAMPLE]. Output format: 3 key numbers, 1 trend, 1 anomaly, 1 recommended action. Include the exact prompt text a business can paste into an agent.</w:t>
+      </w:r>
+    </w:p>
+    <w:p>
+      <w:r>
+        <w:t>Use Case: Selling recurring report automation.</w:t>
+      </w:r>
+    </w:p>
+    <w:p>
+      <w:r>
+        <w:t>Expected Income: $30-100 per setup</w:t>
+      </w:r>
+    </w:p>
+    <w:p/>
+    <w:p>
+      <w:pPr>
+        <w:pStyle w:val="Heading2"/>
+      </w:pPr>
+      <w:r>
+        <w:t>7. Human-in-the-Loop SOP</w:t>
+      </w:r>
+    </w:p>
+    <w:p>
+      <w:pPr>
+        <w:pStyle w:val="PromptBox"/>
+      </w:pPr>
+      <w:r>
+        <w:t>Create a standard operating procedure for a human to review AI agent output: [AGENT OUTPUT]. Include: what to check first, how to approve or reject, how to log corrections back into the agent, and a 5-minute review checklist.</w:t>
+      </w:r>
+    </w:p>
+    <w:p>
+      <w:r>
+        <w:t>Use Case: Making agent services safe and trustworthy.</w:t>
+      </w:r>
+    </w:p>
+    <w:p>
+      <w:r>
+        <w:t>Expected Income: $40-150 per SOP</w:t>
+      </w:r>
+    </w:p>
+    <w:p/>
+    <w:p>
+      <w:pPr>
+        <w:pStyle w:val="Heading2"/>
+      </w:pPr>
+      <w:r>
+        <w:t>8. Lead Qualification Agent</w:t>
+      </w:r>
+    </w:p>
+    <w:p>
+      <w:pPr>
+        <w:pStyle w:val="PromptBox"/>
+      </w:pPr>
+      <w:r>
+        <w:t>Write the prompt for an AI agent that qualifies leads from inbound messages: [MESSAGE EXAMPLES]. Define scoring criteria (budget, timing, fit), the questions it should ask, and how it should route hot leads to sales.</w:t>
+      </w:r>
+    </w:p>
+    <w:p>
+      <w:r>
+        <w:t>Use Case: Lead gen automation for SMBs.</w:t>
+      </w:r>
+    </w:p>
+    <w:p>
+      <w:r>
+        <w:t>Expected Income: $50-200 per prompt</w:t>
+      </w:r>
+    </w:p>
+    <w:p/>
+    <w:p>
+      <w:pPr>
+        <w:pStyle w:val="Heading2"/>
+      </w:pPr>
+      <w:r>
+        <w:t>9. Automation ROI Calculator</w:t>
+      </w:r>
+    </w:p>
+    <w:p>
+      <w:pPr>
+        <w:pStyle w:val="PromptBox"/>
+      </w:pPr>
+      <w:r>
+        <w:t>Given a workflow description, estimate the ROI of automating it: [WORKFLOW]. Show: hours saved per month, cost equivalent, setup effort, and a 12-month payback table. Output as a client-ready one-pager.</w:t>
+      </w:r>
+    </w:p>
+    <w:p>
+      <w:r>
+        <w:t>Use Case: Closing automation deals with hard numbers.</w:t>
+      </w:r>
+    </w:p>
+    <w:p>
+      <w:r>
+        <w:t>Expected Income: $40-150 per estimate</w:t>
+      </w:r>
+    </w:p>
+    <w:p/>
+    <w:p>
+      <w:pPr>
+        <w:pStyle w:val="Heading2"/>
+      </w:pPr>
+      <w:r>
+        <w:t>10. Digital Employee Pitch</w:t>
+      </w:r>
+    </w:p>
+    <w:p>
+      <w:pPr>
+        <w:pStyle w:val="PromptBox"/>
+      </w:pPr>
+      <w:r>
+        <w:t>Write a sales pitch for selling AI agent services to [BUSINESS TYPE]. Include: the problem hook, a specific workflow we would automate, the monthly retainer offer, and a short objection-handling script for 'we tried automation before'.</w:t>
+      </w:r>
+    </w:p>
+    <w:p>
+      <w:r>
+        <w:t>Use Case: Client acquisition for agent deployment services.</w:t>
+      </w:r>
+    </w:p>
+    <w:p>
+      <w:r>
+        <w:t>Expected Income: $50-200 per pitch</w:t>
+      </w:r>
+    </w:p>
+    <w:p/>
     <w:p>
       <w:pPr>
         <w:pStyle w:val="Heading1"/>

</xml_diff>